<commit_message>
correct stem level data and climate level data
</commit_message>
<xml_diff>
--- a/data_paper_and_repo_publication/manuscript/bci-50ha_data-paper_manuscript.docx
+++ b/data_paper_and_repo_publication/manuscript/bci-50ha_data-paper_manuscript.docx
@@ -347,7 +347,7 @@
         <w:t xml:space="preserve">URL</w:t>
       </w:r>
       <w:r>
-        <w:t xml:space="preserve">). We thank Frank H. Levinson for his long support of ForestGEO</w:t>
+        <w:t xml:space="preserve">). Climate data were provided by the Physical Monitoring Program of the Smithsonian Tropical Research Institute. We thank Frank H. Levinson for his long support of ForestGEO</w:t>
       </w:r>
       <w:r>
         <w:t xml:space="preserve"> </w:t>
@@ -443,7 +443,7 @@
         <w:pStyle w:val="FirstParagraph"/>
       </w:pPr>
       <w:r>
-        <w:t xml:space="preserve">The 50-ha Forest Dynamics Plot on Barro Colorado Island (BCI), Panama, is the oldest plot of the Forest Global Earth Observatory (ForestGEO) and one of the most studied tropical forests in the world. In each census, every free-standing woody stem at least 1 cm in diameter at breast height (DBH) in the 1000 × 500 m plot of lowland moist forest is tagged, mapped, identified and measured. We present nine censuses (1982, 1985, 1990, 1995, 2000, 2005, 2010, 2015 and 2022–2023) as nine census tables in the ForestGEO R-table format, with a species table. They describe 460,211 trees and 646,813 stems of 327 taxa in 62 families, with 2,325,471 diameter measurements. This release adds the ninth census, updates the species names, and follows stems consistently across all censuses. Before 2010 only trees were tagged, and the database gave the secondary stems of multi-stemmed trees new identifiers in many censuses, so their histories could not be followed; since 2010 every stem has been tagged. For the 132,220 trees with more than one database stem identifier or a stem tag, we reconstructed the history of every stem with a dynamic-programming model of growth, mortality and recruitment estimated from the tagged censuses, keeping every identity fixed by a field tag or by the database, and we provide posterior samples so that the uncertainty of the reconstruction can be propagated. All nine tables list the same stems in the same order. Each row keeps the field record unchanged (DBH, height of measurement, date, codes and status) and adds an analytical status (prior, alive, dead stem of a living tree, dead tree) assigned by explicit rules. In 2022–2023 the plot held 203,489 living trees (4,070 ha</w:t>
+        <w:t xml:space="preserve">The 50-ha Forest Dynamics Plot on Barro Colorado Island (BCI), Panama, is the oldest plot of the Forest Global Earth Observatory (ForestGEO) and one of the most studied tropical forests in the world. In each census, every free-standing woody stem at least 1 cm in diameter at breast height (DBH) in the 1000 × 500 m plot of lowland moist forest is tagged, mapped, identified and measured. We present nine censuses (1982, 1985, 1990, 1995, 2000, 2005, 2010, 2015 and 2022–2023) as nine census tables in the ForestGEO R-table format, with a species table. They describe 460,211 trees of 327 taxa in 62 families. This release adds the ninth census, updates the species names, and follows stems consistently across all censuses. Before 2010 only trees were tagged, and the database gave the secondary stems of multi-stemmed trees new identifiers in many censuses, so their histories could not be followed; since 2010 every stem has been tagged. For the 132,220 trees with more than one database stem identifier or a stem tag, we reconstructed the history of every stem with a dynamic-programming model of growth, mortality and recruitment estimated from the tagged censuses, keeping every identity fixed by a field tag or by the database, and we provide posterior samples so that the uncertainty of the reconstruction can be propagated. All nine tables list the same stems in the same order. Each row keeps the field record unchanged (DBH, height of measurement, date, codes and status) and adds an analytical status (prior, alive, dead stem of a living tree, dead tree) assigned by explicit rules. In 2022–2023 the plot held 203,489 living trees (4,070 ha</w:t>
       </w:r>
       <w:r>
         <w:rPr>
@@ -452,7 +452,7 @@
         <w:t xml:space="preserve">−1</w:t>
       </w:r>
       <w:r>
-        <w:t xml:space="preserve">; bootstrap 95% interval 4,023–4,114) with 244,204 living stems, of 300 species, 180 genera and 59 families, and a basal area of 34.31 m</w:t>
+        <w:t xml:space="preserve">; bootstrap 95% interval 4,023–4,114) of 300 species, 180 genera and 59 families, and a basal area of 34.31 m</w:t>
       </w:r>
       <w:r>
         <w:rPr>
@@ -708,7 +708,7 @@
         <w:t xml:space="preserve"> </w:t>
       </w:r>
       <w:r>
-        <w:t xml:space="preserve">The plot is a 1000 × 500 m rectangle (50 ha) of 1,250 quadrats of 20 × 20 m. The nine censuses span March 1981 to December 2023 (Table 1); a census took from nine months (1985) to almost three years (1990–1992). Consecutive censuses of a tree were about 5 years apart, except 3.4 years (censuses 1–2) and 7.5 years (8–9). Every record carries its date.</w:t>
+        <w:t xml:space="preserve">The plot is a 1000 × 500 m rectangle (50 ha) of 1,250 quadrats of 20 × 20 m. The nine censuses span March 1981 to December 2023 (Table 1); 95% of the records of a census were taken within 8–10 months, except in 1981–1982 (19 months) and 2022–2023 (15 months). Consecutive censuses of a tree were about 5 years apart, except 3.4 years (censuses 1–2) and 7.5 years (8–9).</w:t>
       </w:r>
     </w:p>
     <w:p>
@@ -804,7 +804,7 @@
         <w:t xml:space="preserve"> </w:t>
       </w:r>
       <w:r>
-        <w:t xml:space="preserve">together identify a stem. Of the 460,211 trees, 104,889 had more than one stem during the study.</w:t>
+        <w:t xml:space="preserve">together identify a stem.</w:t>
       </w:r>
     </w:p>
     <w:p>
@@ -927,7 +927,7 @@
         <w:t xml:space="preserve"> </w:t>
       </w:r>
       <w:r>
-        <w:t xml:space="preserve">The tables hold 2,818,748 field records, 2,325,471 of them with a diameter. Living trees ranged from 244,252 (1990) to 203,489 (2022–2023), and living stems from 287,115 (1990) to 244,204 (2022–2023; Table 1).</w:t>
+        <w:t xml:space="preserve">Living trees ranged from 244,252 (1990) to 203,489 (2022–2023; Table 1).</w:t>
       </w:r>
     </w:p>
     <w:p>
@@ -1081,7 +1081,7 @@
         <w:t xml:space="preserve"> </w:t>
       </w:r>
       <w:r>
-        <w:t xml:space="preserve">island in Gatun Lake, Panama, isolated when the lake was formed during the construction of the Panama Canal (1910–1914) and protected since 1923. It is part of the Barro Colorado Nature Monument, where the Smithsonian Tropical Research Institute runs a field station. The plot lies on the central plateau of the island, at 120–160 m above sea level, in old-growth lowland tropical moist forest that includes a small area of younger forest (Harms et al. 2001). Rainfall averages about 2,600 mm per year, with a dry season from January to April (Leigh 1999).</w:t>
+        <w:t xml:space="preserve">island in Gatun Lake, Panama, isolated when the lake was formed during the construction of the Panama Canal (1910–1914) and protected since 1923. It is part of the Barro Colorado Nature Monument, where the Smithsonian Tropical Research Institute runs a field station. The plot lies on the central plateau of the island, at 120–160 m above sea level, in old-growth lowland tropical moist forest that includes a small area of younger forest (Harms et al. 2001). From 1982 to 2023, annual rainfall averaged 2,621 mm (SD 510 mm; range 1,699–4,135 mm), 9% of it in the dry season from January to April (Leigh 1999); the monthly mean air temperature ranged from 25.1 °C in November to 26.8 °C in April, around an annual mean of 25.9 °C (Paton 2026).</w:t>
       </w:r>
     </w:p>
     <w:p>
@@ -1277,7 +1277,7 @@
         <w:t xml:space="preserve"> </w:t>
       </w:r>
       <w:r>
-        <w:t xml:space="preserve">An alive stem without a diameter is either a missed measurement (1,789 cells, which can be interpolated from the stem’s own measurements) or a stump (777 cells: alive, broken below, with no stem at 1.3 m, to be left out of stocks).</w:t>
+        <w:t xml:space="preserve">An alive stem without a diameter is either a missed measurement, which can be interpolated from the stem’s own measurements, or a stump (alive, broken below, with no stem at 1.3 m), to be left out of stocks.</w:t>
       </w:r>
     </w:p>
     <w:p>
@@ -1295,7 +1295,7 @@
         <w:t xml:space="preserve"> </w:t>
       </w:r>
       <w:r>
-        <w:t xml:space="preserve">Censuses lasted up to 2.8 years, intervals differ among quadrats, census 9 came 7.5 years after census 8, and the interrupted census of 2020 is not included. Intervals should be computed from</w:t>
+        <w:t xml:space="preserve">Censuses took up to 19 months (95% of the records; Table 1), intervals differ among quadrats, census 9 came 7.5 years after census 8, and the interrupted census of 2020 is not included. Intervals should be computed from</w:t>
       </w:r>
       <w:r>
         <w:t xml:space="preserve"> </w:t>
@@ -1425,31 +1425,19 @@
         <w:t xml:space="preserve"> </w:t>
       </w:r>
       <w:r>
-        <w:t xml:space="preserve">Censuses of the BCI 50-ha plot in this release. Records: rows with a field record (</w:t>
+        <w:t xml:space="preserve">Censuses of the BCI 50-ha plot in this release. Field dates: the 2.5% and 97.5% quantiles of the record dates (95% of the records were taken between them); median date: the median of the record dates. Living trees: trees with at least one living stem (</w:t>
       </w:r>
       <w:r>
         <w:rPr>
           <w:rStyle w:val="VerbatimChar"/>
         </w:rPr>
-        <w:t xml:space="preserve">DFstatus</w:t>
-      </w:r>
-      <w:r>
-        <w:t xml:space="preserve">). Measurements: records with a diameter. Living stems:</w:t>
-      </w:r>
-      <w:r>
-        <w:t xml:space="preserve"> </w:t>
-      </w:r>
-      <w:r>
-        <w:rPr>
-          <w:rStyle w:val="VerbatimChar"/>
-        </w:rPr>
         <w:t xml:space="preserve">Rstatus</w:t>
       </w:r>
       <w:r>
         <w:t xml:space="preserve"> </w:t>
       </w:r>
       <w:r>
-        <w:t xml:space="preserve">A; living trees: trees with at least one living stem.</w:t>
+        <w:t xml:space="preserve">A).</w:t>
       </w:r>
     </w:p>
     <w:tbl>
@@ -1460,13 +1448,11 @@
         <w:tblLook w:firstRow="1" w:lastRow="0" w:firstColumn="0" w:lastColumn="0" w:noHBand="0" w:noVBand="0" w:val="0020"/>
       </w:tblPr>
       <w:tblGrid>
-        <w:gridCol w:w="819"/>
-        <w:gridCol w:w="819"/>
-        <w:gridCol w:w="3004"/>
-        <w:gridCol w:w="819"/>
-        <w:gridCol w:w="819"/>
-        <w:gridCol w:w="819"/>
-        <w:gridCol w:w="819"/>
+        <w:gridCol w:w="913"/>
+        <w:gridCol w:w="913"/>
+        <w:gridCol w:w="3350"/>
+        <w:gridCol w:w="1827"/>
+        <w:gridCol w:w="913"/>
       </w:tblGrid>
       <w:tr>
         <w:trPr>
@@ -1504,43 +1490,19 @@
               <w:jc w:val="left"/>
             </w:pPr>
             <w:r>
-              <w:t xml:space="preserve">Field dates</w:t>
-            </w:r>
-          </w:p>
-        </w:tc>
-        <w:tc>
-          <w:tcPr/>
-          <w:p>
-            <w:pPr>
-              <w:pStyle w:val="TableText"/>
-              <w:jc w:val="right"/>
-            </w:pPr>
-            <w:r>
-              <w:t xml:space="preserve">Records</w:t>
-            </w:r>
-          </w:p>
-        </w:tc>
-        <w:tc>
-          <w:tcPr/>
-          <w:p>
-            <w:pPr>
-              <w:pStyle w:val="TableText"/>
-              <w:jc w:val="right"/>
-            </w:pPr>
-            <w:r>
-              <w:t xml:space="preserve">Measurements</w:t>
-            </w:r>
-          </w:p>
-        </w:tc>
-        <w:tc>
-          <w:tcPr/>
-          <w:p>
-            <w:pPr>
-              <w:pStyle w:val="TableText"/>
-              <w:jc w:val="right"/>
-            </w:pPr>
-            <w:r>
-              <w:t xml:space="preserve">Living stems</w:t>
+              <w:t xml:space="preserve">Field dates (95% of records)</w:t>
+            </w:r>
+          </w:p>
+        </w:tc>
+        <w:tc>
+          <w:tcPr/>
+          <w:p>
+            <w:pPr>
+              <w:pStyle w:val="TableText"/>
+              <w:jc w:val="left"/>
+            </w:pPr>
+            <w:r>
+              <w:t xml:space="preserve">Median date</w:t>
             </w:r>
           </w:p>
         </w:tc>
@@ -1590,43 +1552,19 @@
               <w:jc w:val="left"/>
             </w:pPr>
             <w:r>
-              <w:t xml:space="preserve">1981-03-11 to 1983-07-30</w:t>
-            </w:r>
-          </w:p>
-        </w:tc>
-        <w:tc>
-          <w:tcPr/>
-          <w:p>
-            <w:pPr>
-              <w:pStyle w:val="TableText"/>
-              <w:jc w:val="right"/>
-            </w:pPr>
-            <w:r>
-              <w:t xml:space="preserve">263,934</w:t>
-            </w:r>
-          </w:p>
-        </w:tc>
-        <w:tc>
-          <w:tcPr/>
-          <w:p>
-            <w:pPr>
-              <w:pStyle w:val="TableText"/>
-              <w:jc w:val="right"/>
-            </w:pPr>
-            <w:r>
-              <w:t xml:space="preserve">263,896</w:t>
-            </w:r>
-          </w:p>
-        </w:tc>
-        <w:tc>
-          <w:tcPr/>
-          <w:p>
-            <w:pPr>
-              <w:pStyle w:val="TableText"/>
-              <w:jc w:val="right"/>
-            </w:pPr>
-            <w:r>
-              <w:t xml:space="preserve">263,896</w:t>
+              <w:t xml:space="preserve">1981-04-04 to 1982-10-22</w:t>
+            </w:r>
+          </w:p>
+        </w:tc>
+        <w:tc>
+          <w:tcPr/>
+          <w:p>
+            <w:pPr>
+              <w:pStyle w:val="TableText"/>
+              <w:jc w:val="left"/>
+            </w:pPr>
+            <w:r>
+              <w:t xml:space="preserve">1982-01-08</w:t>
             </w:r>
           </w:p>
         </w:tc>
@@ -1676,43 +1614,19 @@
               <w:jc w:val="left"/>
             </w:pPr>
             <w:r>
-              <w:t xml:space="preserve">1985-01-05 to 1985-10-05</w:t>
-            </w:r>
-          </w:p>
-        </w:tc>
-        <w:tc>
-          <w:tcPr/>
-          <w:p>
-            <w:pPr>
-              <w:pStyle w:val="TableText"/>
-              <w:jc w:val="right"/>
-            </w:pPr>
-            <w:r>
-              <w:t xml:space="preserve">299,447</w:t>
-            </w:r>
-          </w:p>
-        </w:tc>
-        <w:tc>
-          <w:tcPr/>
-          <w:p>
-            <w:pPr>
-              <w:pStyle w:val="TableText"/>
-              <w:jc w:val="right"/>
-            </w:pPr>
-            <w:r>
-              <w:t xml:space="preserve">273,062</w:t>
-            </w:r>
-          </w:p>
-        </w:tc>
-        <w:tc>
-          <w:tcPr/>
-          <w:p>
-            <w:pPr>
-              <w:pStyle w:val="TableText"/>
-              <w:jc w:val="right"/>
-            </w:pPr>
-            <w:r>
-              <w:t xml:space="preserve">273,598</w:t>
+              <w:t xml:space="preserve">1985-01-15 to 1985-09-04</w:t>
+            </w:r>
+          </w:p>
+        </w:tc>
+        <w:tc>
+          <w:tcPr/>
+          <w:p>
+            <w:pPr>
+              <w:pStyle w:val="TableText"/>
+              <w:jc w:val="left"/>
+            </w:pPr>
+            <w:r>
+              <w:t xml:space="preserve">1985-05-03</w:t>
             </w:r>
           </w:p>
         </w:tc>
@@ -1762,43 +1676,19 @@
               <w:jc w:val="left"/>
             </w:pPr>
             <w:r>
-              <w:t xml:space="preserve">1990-02-06 to 1992-12-04</w:t>
-            </w:r>
-          </w:p>
-        </w:tc>
-        <w:tc>
-          <w:tcPr/>
-          <w:p>
-            <w:pPr>
-              <w:pStyle w:val="TableText"/>
-              <w:jc w:val="right"/>
-            </w:pPr>
-            <w:r>
-              <w:t xml:space="preserve">328,634</w:t>
-            </w:r>
-          </w:p>
-        </w:tc>
-        <w:tc>
-          <w:tcPr/>
-          <w:p>
-            <w:pPr>
-              <w:pStyle w:val="TableText"/>
-              <w:jc w:val="right"/>
-            </w:pPr>
-            <w:r>
-              <w:t xml:space="preserve">286,910</w:t>
-            </w:r>
-          </w:p>
-        </w:tc>
-        <w:tc>
-          <w:tcPr/>
-          <w:p>
-            <w:pPr>
-              <w:pStyle w:val="TableText"/>
-              <w:jc w:val="right"/>
-            </w:pPr>
-            <w:r>
-              <w:t xml:space="preserve">287,115</w:t>
+              <w:t xml:space="preserve">1990-02-15 to 1990-12-19</w:t>
+            </w:r>
+          </w:p>
+        </w:tc>
+        <w:tc>
+          <w:tcPr/>
+          <w:p>
+            <w:pPr>
+              <w:pStyle w:val="TableText"/>
+              <w:jc w:val="left"/>
+            </w:pPr>
+            <w:r>
+              <w:t xml:space="preserve">1990-08-21</w:t>
             </w:r>
           </w:p>
         </w:tc>
@@ -1848,43 +1738,19 @@
               <w:jc w:val="left"/>
             </w:pPr>
             <w:r>
-              <w:t xml:space="preserve">1995-01-02 to 1996-02-15</w:t>
-            </w:r>
-          </w:p>
-        </w:tc>
-        <w:tc>
-          <w:tcPr/>
-          <w:p>
-            <w:pPr>
-              <w:pStyle w:val="TableText"/>
-              <w:jc w:val="right"/>
-            </w:pPr>
-            <w:r>
-              <w:t xml:space="preserve">317,354</w:t>
-            </w:r>
-          </w:p>
-        </w:tc>
-        <w:tc>
-          <w:tcPr/>
-          <w:p>
-            <w:pPr>
-              <w:pStyle w:val="TableText"/>
-              <w:jc w:val="right"/>
-            </w:pPr>
-            <w:r>
-              <w:t xml:space="preserve">267,448</w:t>
-            </w:r>
-          </w:p>
-        </w:tc>
-        <w:tc>
-          <w:tcPr/>
-          <w:p>
-            <w:pPr>
-              <w:pStyle w:val="TableText"/>
-              <w:jc w:val="right"/>
-            </w:pPr>
-            <w:r>
-              <w:t xml:space="preserve">267,625</w:t>
+              <w:t xml:space="preserve">1995-01-06 to 1995-10-03</w:t>
+            </w:r>
+          </w:p>
+        </w:tc>
+        <w:tc>
+          <w:tcPr/>
+          <w:p>
+            <w:pPr>
+              <w:pStyle w:val="TableText"/>
+              <w:jc w:val="left"/>
+            </w:pPr>
+            <w:r>
+              <w:t xml:space="preserve">1995-05-18</w:t>
             </w:r>
           </w:p>
         </w:tc>
@@ -1934,43 +1800,19 @@
               <w:jc w:val="left"/>
             </w:pPr>
             <w:r>
-              <w:t xml:space="preserve">2000-01-03 to 2001-03-31</w:t>
-            </w:r>
-          </w:p>
-        </w:tc>
-        <w:tc>
-          <w:tcPr/>
-          <w:p>
-            <w:pPr>
-              <w:pStyle w:val="TableText"/>
-              <w:jc w:val="right"/>
-            </w:pPr>
-            <w:r>
-              <w:t xml:space="preserve">298,817</w:t>
-            </w:r>
-          </w:p>
-        </w:tc>
-        <w:tc>
-          <w:tcPr/>
-          <w:p>
-            <w:pPr>
-              <w:pStyle w:val="TableText"/>
-              <w:jc w:val="right"/>
-            </w:pPr>
-            <w:r>
-              <w:t xml:space="preserve">249,546</w:t>
-            </w:r>
-          </w:p>
-        </w:tc>
-        <w:tc>
-          <w:tcPr/>
-          <w:p>
-            <w:pPr>
-              <w:pStyle w:val="TableText"/>
-              <w:jc w:val="right"/>
-            </w:pPr>
-            <w:r>
-              <w:t xml:space="preserve">249,831</w:t>
+              <w:t xml:space="preserve">2000-01-13 to 2000-09-21</w:t>
+            </w:r>
+          </w:p>
+        </w:tc>
+        <w:tc>
+          <w:tcPr/>
+          <w:p>
+            <w:pPr>
+              <w:pStyle w:val="TableText"/>
+              <w:jc w:val="left"/>
+            </w:pPr>
+            <w:r>
+              <w:t xml:space="preserve">2000-05-10</w:t>
             </w:r>
           </w:p>
         </w:tc>
@@ -2020,43 +1862,19 @@
               <w:jc w:val="left"/>
             </w:pPr>
             <w:r>
-              <w:t xml:space="preserve">2005-01-03 to 2006-01-24</w:t>
-            </w:r>
-          </w:p>
-        </w:tc>
-        <w:tc>
-          <w:tcPr/>
-          <w:p>
-            <w:pPr>
-              <w:pStyle w:val="TableText"/>
-              <w:jc w:val="right"/>
-            </w:pPr>
-            <w:r>
-              <w:t xml:space="preserve">287,494</w:t>
-            </w:r>
-          </w:p>
-        </w:tc>
-        <w:tc>
-          <w:tcPr/>
-          <w:p>
-            <w:pPr>
-              <w:pStyle w:val="TableText"/>
-              <w:jc w:val="right"/>
-            </w:pPr>
-            <w:r>
-              <w:t xml:space="preserve">244,793</w:t>
-            </w:r>
-          </w:p>
-        </w:tc>
-        <w:tc>
-          <w:tcPr/>
-          <w:p>
-            <w:pPr>
-              <w:pStyle w:val="TableText"/>
-              <w:jc w:val="right"/>
-            </w:pPr>
-            <w:r>
-              <w:t xml:space="preserve">244,965</w:t>
+              <w:t xml:space="preserve">2005-01-19 to 2005-10-05</w:t>
+            </w:r>
+          </w:p>
+        </w:tc>
+        <w:tc>
+          <w:tcPr/>
+          <w:p>
+            <w:pPr>
+              <w:pStyle w:val="TableText"/>
+              <w:jc w:val="left"/>
+            </w:pPr>
+            <w:r>
+              <w:t xml:space="preserve">2005-05-30</w:t>
             </w:r>
           </w:p>
         </w:tc>
@@ -2106,43 +1924,19 @@
               <w:jc w:val="left"/>
             </w:pPr>
             <w:r>
-              <w:t xml:space="preserve">2010-01-18 to 2011-03-28</w:t>
-            </w:r>
-          </w:p>
-        </w:tc>
-        <w:tc>
-          <w:tcPr/>
-          <w:p>
-            <w:pPr>
-              <w:pStyle w:val="TableText"/>
-              <w:jc w:val="right"/>
-            </w:pPr>
-            <w:r>
-              <w:t xml:space="preserve">317,226</w:t>
-            </w:r>
-          </w:p>
-        </w:tc>
-        <w:tc>
-          <w:tcPr/>
-          <w:p>
-            <w:pPr>
-              <w:pStyle w:val="TableText"/>
-              <w:jc w:val="right"/>
-            </w:pPr>
-            <w:r>
-              <w:t xml:space="preserve">246,898</w:t>
-            </w:r>
-          </w:p>
-        </w:tc>
-        <w:tc>
-          <w:tcPr/>
-          <w:p>
-            <w:pPr>
-              <w:pStyle w:val="TableText"/>
-              <w:jc w:val="right"/>
-            </w:pPr>
-            <w:r>
-              <w:t xml:space="preserve">247,731</w:t>
+              <w:t xml:space="preserve">2010-01-21 to 2010-09-14</w:t>
+            </w:r>
+          </w:p>
+        </w:tc>
+        <w:tc>
+          <w:tcPr/>
+          <w:p>
+            <w:pPr>
+              <w:pStyle w:val="TableText"/>
+              <w:jc w:val="left"/>
+            </w:pPr>
+            <w:r>
+              <w:t xml:space="preserve">2010-05-14</w:t>
             </w:r>
           </w:p>
         </w:tc>
@@ -2192,43 +1986,19 @@
               <w:jc w:val="left"/>
             </w:pPr>
             <w:r>
-              <w:t xml:space="preserve">2013-09-01 to 2016-02-18</w:t>
-            </w:r>
-          </w:p>
-        </w:tc>
-        <w:tc>
-          <w:tcPr/>
-          <w:p>
-            <w:pPr>
-              <w:pStyle w:val="TableText"/>
-              <w:jc w:val="right"/>
-            </w:pPr>
-            <w:r>
-              <w:t xml:space="preserve">335,207</w:t>
-            </w:r>
-          </w:p>
-        </w:tc>
-        <w:tc>
-          <w:tcPr/>
-          <w:p>
-            <w:pPr>
-              <w:pStyle w:val="TableText"/>
-              <w:jc w:val="right"/>
-            </w:pPr>
-            <w:r>
-              <w:t xml:space="preserve">248,713</w:t>
-            </w:r>
-          </w:p>
-        </w:tc>
-        <w:tc>
-          <w:tcPr/>
-          <w:p>
-            <w:pPr>
-              <w:pStyle w:val="TableText"/>
-              <w:jc w:val="right"/>
-            </w:pPr>
-            <w:r>
-              <w:t xml:space="preserve">249,054</w:t>
+              <w:t xml:space="preserve">2015-02-19 to 2015-11-27</w:t>
+            </w:r>
+          </w:p>
+        </w:tc>
+        <w:tc>
+          <w:tcPr/>
+          <w:p>
+            <w:pPr>
+              <w:pStyle w:val="TableText"/>
+              <w:jc w:val="left"/>
+            </w:pPr>
+            <w:r>
+              <w:t xml:space="preserve">2015-07-01</w:t>
             </w:r>
           </w:p>
         </w:tc>
@@ -2266,55 +2036,31 @@
               <w:jc w:val="left"/>
             </w:pPr>
             <w:r>
-              <w:t xml:space="preserve">2022</w:t>
-            </w:r>
-          </w:p>
-        </w:tc>
-        <w:tc>
-          <w:tcPr/>
-          <w:p>
-            <w:pPr>
-              <w:pStyle w:val="TableText"/>
-              <w:jc w:val="left"/>
-            </w:pPr>
-            <w:r>
-              <w:t xml:space="preserve">2022-02-15 to 2023-12-23</w:t>
-            </w:r>
-          </w:p>
-        </w:tc>
-        <w:tc>
-          <w:tcPr/>
-          <w:p>
-            <w:pPr>
-              <w:pStyle w:val="TableText"/>
-              <w:jc w:val="right"/>
-            </w:pPr>
-            <w:r>
-              <w:t xml:space="preserve">370,635</w:t>
-            </w:r>
-          </w:p>
-        </w:tc>
-        <w:tc>
-          <w:tcPr/>
-          <w:p>
-            <w:pPr>
-              <w:pStyle w:val="TableText"/>
-              <w:jc w:val="right"/>
-            </w:pPr>
-            <w:r>
-              <w:t xml:space="preserve">244,205</w:t>
-            </w:r>
-          </w:p>
-        </w:tc>
-        <w:tc>
-          <w:tcPr/>
-          <w:p>
-            <w:pPr>
-              <w:pStyle w:val="TableText"/>
-              <w:jc w:val="right"/>
-            </w:pPr>
-            <w:r>
-              <w:t xml:space="preserve">244,204</w:t>
+              <w:t xml:space="preserve">2023</w:t>
+            </w:r>
+          </w:p>
+        </w:tc>
+        <w:tc>
+          <w:tcPr/>
+          <w:p>
+            <w:pPr>
+              <w:pStyle w:val="TableText"/>
+              <w:jc w:val="left"/>
+            </w:pPr>
+            <w:r>
+              <w:t xml:space="preserve">2022-03-04 to 2023-06-15</w:t>
+            </w:r>
+          </w:p>
+        </w:tc>
+        <w:tc>
+          <w:tcPr/>
+          <w:p>
+            <w:pPr>
+              <w:pStyle w:val="TableText"/>
+              <w:jc w:val="left"/>
+            </w:pPr>
+            <w:r>
+              <w:t xml:space="preserve">2023-02-10</w:t>
             </w:r>
           </w:p>
         </w:tc>
@@ -2677,27 +2423,42 @@
               <w:rPr>
                 <w:rStyle w:val="VerbatimChar"/>
               </w:rPr>
-              <w:t xml:space="preserve">code/1_tables.R, 2_data-description.R, 3_census-9-summary.R</w:t>
-            </w:r>
-          </w:p>
-        </w:tc>
-        <w:tc>
-          <w:tcPr/>
-          <w:p>
-            <w:pPr>
-              <w:pStyle w:val="TableText"/>
-            </w:pPr>
-          </w:p>
-        </w:tc>
-        <w:tc>
-          <w:tcPr/>
-          <w:p>
-            <w:pPr>
-              <w:pStyle w:val="TableText"/>
-              <w:jc w:val="left"/>
-            </w:pPr>
-            <w:r>
-              <w:t xml:space="preserve">Reproduces the tables and numbers of this paper</w:t>
+              <w:t xml:space="preserve">code/1_tables.R</w:t>
+            </w:r>
+            <w:r>
+              <w:t xml:space="preserve"> </w:t>
+            </w:r>
+            <w:r>
+              <w:t xml:space="preserve">…</w:t>
+            </w:r>
+            <w:r>
+              <w:t xml:space="preserve"> </w:t>
+            </w:r>
+            <w:r>
+              <w:rPr>
+                <w:rStyle w:val="VerbatimChar"/>
+              </w:rPr>
+              <w:t xml:space="preserve">3_census-9-summary.R</w:t>
+            </w:r>
+          </w:p>
+        </w:tc>
+        <w:tc>
+          <w:tcPr/>
+          <w:p>
+            <w:pPr>
+              <w:pStyle w:val="TableText"/>
+            </w:pPr>
+          </w:p>
+        </w:tc>
+        <w:tc>
+          <w:tcPr/>
+          <w:p>
+            <w:pPr>
+              <w:pStyle w:val="TableText"/>
+              <w:jc w:val="left"/>
+            </w:pPr>
+            <w:r>
+              <w:t xml:space="preserve">Reproduce the tables and the numbers of the data in this paper</w:t>
             </w:r>
           </w:p>
         </w:tc>
@@ -3657,7 +3418,7 @@
         <w:t xml:space="preserve">Rstatus</w:t>
       </w:r>
       <w:r>
-        <w:t xml:space="preserve">). Evidence of life is an alive record, or a diameter on a broken-below, missing or status-less record. A dead record is dead or stem dead, or broken below without a diameter. Counts over the nine tables: A 2,328,019; P 1,755,546; D 1,377,759; G 359,993.</w:t>
+        <w:t xml:space="preserve">). Evidence of life is an alive record, or a diameter on a broken-below, missing or status-less record. A dead record is dead or stem dead, or broken below without a diameter.</w:t>
       </w:r>
     </w:p>
     <w:tbl>
@@ -4638,6 +4399,37 @@
         <w:pStyle w:val="BodyText"/>
       </w:pPr>
       <w:r>
+        <w:t xml:space="preserve">Paton, S. 2026.</w:t>
+      </w:r>
+      <w:r>
+        <w:t xml:space="preserve"> </w:t>
+      </w:r>
+      <w:r>
+        <w:t xml:space="preserve">“Monthly Summary_BCI, Horizontal.”</w:t>
+      </w:r>
+      <w:r>
+        <w:t xml:space="preserve"> </w:t>
+      </w:r>
+      <w:r>
+        <w:t xml:space="preserve">Smithsonian Tropical Research Institute, Physical Monitoring Program. Smithsonian Research Data Repository.</w:t>
+      </w:r>
+      <w:r>
+        <w:t xml:space="preserve"> </w:t>
+      </w:r>
+      <w:hyperlink r:id="rId41">
+        <w:r>
+          <w:rPr>
+            <w:rStyle w:val="Hyperlink"/>
+          </w:rPr>
+          <w:t xml:space="preserve">https://doi.org/10.60635/C3992K</w:t>
+        </w:r>
+      </w:hyperlink>
+    </w:p>
+    <w:p>
+      <w:pPr>
+        <w:pStyle w:val="BodyText"/>
+      </w:pPr>
+      <w:r>
         <w:t xml:space="preserve">Piponiot, C., K. J. Anderson-Teixeira, S. J. Davies, D. Allen, N. A. Bourg, D. F. R. P. Burslem, D. Cárdenas, et al. 2022.</w:t>
       </w:r>
       <w:r>
@@ -4665,7 +4457,7 @@
       <w:r>
         <w:t xml:space="preserve"> </w:t>
       </w:r>
-      <w:hyperlink r:id="rId41">
+      <w:hyperlink r:id="rId42">
         <w:r>
           <w:rPr>
             <w:rStyle w:val="Hyperlink"/>
@@ -4709,7 +4501,7 @@
       <w:r>
         <w:t xml:space="preserve"> </w:t>
       </w:r>
-      <w:hyperlink r:id="rId42">
+      <w:hyperlink r:id="rId43">
         <w:r>
           <w:rPr>
             <w:rStyle w:val="Hyperlink"/>
@@ -4750,7 +4542,7 @@
       <w:r>
         <w:t xml:space="preserve"> </w:t>
       </w:r>
-      <w:hyperlink r:id="rId43">
+      <w:hyperlink r:id="rId44">
         <w:r>
           <w:rPr>
             <w:rStyle w:val="Hyperlink"/>
@@ -4791,7 +4583,7 @@
       <w:r>
         <w:t xml:space="preserve"> </w:t>
       </w:r>
-      <w:hyperlink r:id="rId44">
+      <w:hyperlink r:id="rId45">
         <w:r>
           <w:rPr>
             <w:rStyle w:val="Hyperlink"/>
@@ -4832,7 +4624,7 @@
       <w:r>
         <w:t xml:space="preserve"> </w:t>
       </w:r>
-      <w:hyperlink r:id="rId45">
+      <w:hyperlink r:id="rId46">
         <w:r>
           <w:rPr>
             <w:rStyle w:val="Hyperlink"/>
@@ -4863,7 +4655,7 @@
       <w:r>
         <w:t xml:space="preserve"> </w:t>
       </w:r>
-      <w:hyperlink r:id="rId46">
+      <w:hyperlink r:id="rId47">
         <w:r>
           <w:rPr>
             <w:rStyle w:val="Hyperlink"/>

</xml_diff>

<commit_message>
rerun data and repo code
</commit_message>
<xml_diff>
--- a/data_paper_and_repo_publication/manuscript/bci-50ha_data-paper_manuscript.docx
+++ b/data_paper_and_repo_publication/manuscript/bci-50ha_data-paper_manuscript.docx
@@ -348,7 +348,7 @@
         <w:t>−1</w:t>
       </w:r>
       <w:r>
-        <w:t>; bootstrap 95% interval 4,023–4,114) of 300 species, 180 genera and 59 families, and a basal area of 34.31 m</w:t>
+        <w:t>; bootstrap 95% interval 4,023–4,114) of 300 species, 179 genera and 59 families, and a basal area of 34.31 m</w:t>
       </w:r>
       <w:r>
         <w:rPr>
@@ -569,7 +569,7 @@
         <w:t>Taxa.</w:t>
       </w:r>
       <w:r>
-        <w:t xml:space="preserve"> The censuses include every free-standing woody plant: trees, shrubs, palms, tree ferns and strangler figs; lianas are not included. The 327 taxa of the species table belong to 192 genera and 62 families. Four are morphospecies, and one further code (</w:t>
+        <w:t xml:space="preserve"> The censuses include every free-standing woody plant: trees, shrubs, palms, tree ferns and strangler figs; lianas are not included. The 327 taxa of the species table belong to 191 genera and 62 families. Four are morphospecies, and one further code (</w:t>
       </w:r>
       <w:r>
         <w:rPr>
@@ -681,7 +681,7 @@
         <w:t>stemID</w:t>
       </w:r>
       <w:r>
-        <w:t xml:space="preserve">), including the censuses before the stem appeared and after it died. The species table (328 rows, 17 columns) gives for each species code the taxonomy, authority, synonyms, growth forms, common name, herbarium collections and, for the 49 codes renamed since 2019, the 2019 name and the kind of change; it joins the census tables on </w:t>
+        <w:t xml:space="preserve">), including the censuses before the stem appeared and after it died. The species table (328 rows, 17 columns) gives for each species code the taxonomy, authority, synonyms, growth forms, common name, herbarium collections and, for the 50 codes renamed since 2019, the 2019 name and the kind of change; it joins the census tables on </w:t>
       </w:r>
       <w:r>
         <w:rPr>

</xml_diff>

<commit_message>
data paper: authors, acknowledgments and census-9 description
Condit, Hubbell and Foster left out until they confirm; blank ORCID lines;
NSF grants and Levinson Family Foundation in the acknowledgments; census
team names to fill in; census-9 paragraph in the Data Description and no
intervals in the abstract; keywords of Metadata and README match the
manuscript; field-code list removed.
</commit_message>
<xml_diff>
--- a/data_paper_and_repo_publication/manuscript/bci-50ha_data-paper_manuscript.docx
+++ b/data_paper_and_repo_publication/manuscript/bci-50ha_data-paper_manuscript.docx
@@ -51,201 +51,177 @@
         <w:t>1</w:t>
       </w:r>
       <w:r>
-        <w:t>, Richard Condit</w:t>
+        <w:t>, Stuart J. Davies</w:t>
       </w:r>
       <w:r>
         <w:rPr>
           <w:vertAlign w:val="superscript"/>
         </w:rPr>
-        <w:t>2</w:t>
-      </w:r>
-      <w:r>
-        <w:t>, Stephen P. Hubbell</w:t>
+        <w:t>1</w:t>
+      </w:r>
+      <w:r>
+        <w:t>, José A. Medina-Vega</w:t>
       </w:r>
       <w:r>
         <w:rPr>
           <w:vertAlign w:val="superscript"/>
         </w:rPr>
-        <w:t>3</w:t>
-      </w:r>
-      <w:r>
-        <w:t>, Robin B. Foster</w:t>
-      </w:r>
+        <w:t>1</w:t>
+      </w:r>
+    </w:p>
+    <w:p>
+      <w:pPr>
+        <w:pStyle w:val="BodyText"/>
+      </w:pPr>
       <w:r>
         <w:rPr>
           <w:vertAlign w:val="superscript"/>
         </w:rPr>
-        <w:t>4</w:t>
-      </w:r>
-      <w:r>
-        <w:t>, Stuart J. Davies</w:t>
-      </w:r>
-      <w:r>
-        <w:rPr>
-          <w:vertAlign w:val="superscript"/>
-        </w:rPr>
         <w:t>1</w:t>
       </w:r>
       <w:r>
-        <w:t>, José A. Medina-Vega</w:t>
-      </w:r>
-      <w:r>
-        <w:rPr>
-          <w:vertAlign w:val="superscript"/>
-        </w:rPr>
-        <w:t>1</w:t>
+        <w:t xml:space="preserve"> Smithsonian Tropical Research Institute, Apartado 0843-03092, Balboa, Ancón, Republic of Panama</w:t>
       </w:r>
     </w:p>
     <w:p>
       <w:pPr>
         <w:pStyle w:val="BodyText"/>
-      </w:pPr>
-      <w:r>
-        <w:rPr>
-          <w:vertAlign w:val="superscript"/>
-        </w:rPr>
-        <w:t>1</w:t>
-      </w:r>
-      <w:r>
-        <w:t xml:space="preserve"> Smithsonian Tropical Research Institute, Apartado 0843-03092, Balboa, Ancón, Republic of Panama</w:t>
-      </w:r>
-      <w:r>
-        <w:br/>
-      </w:r>
-      <w:r>
-        <w:rPr>
-          <w:vertAlign w:val="superscript"/>
-        </w:rPr>
-        <w:t>2</w:t>
-      </w:r>
-      <w:r>
-        <w:t xml:space="preserve"> </w:t>
-      </w:r>
-      <w:r>
-        <w:rPr>
-          <w:highlight w:val="yellow"/>
-        </w:rPr>
-        <w:t>Affiliation to confirm (University of California, Santa Cruz, in Condit et al. 2019a)</w:t>
-      </w:r>
-      <w:r>
-        <w:br/>
-      </w:r>
-      <w:r>
-        <w:rPr>
-          <w:vertAlign w:val="superscript"/>
-        </w:rPr>
-        <w:t>3</w:t>
-      </w:r>
-      <w:r>
-        <w:t xml:space="preserve"> </w:t>
-      </w:r>
-      <w:r>
-        <w:rPr>
-          <w:highlight w:val="yellow"/>
-        </w:rPr>
-        <w:t>Affiliation to confirm (University of California, Los Angeles, in Condit et al. 2019a)</w:t>
-      </w:r>
-      <w:r>
-        <w:br/>
-      </w:r>
-      <w:r>
-        <w:rPr>
-          <w:vertAlign w:val="superscript"/>
-        </w:rPr>
-        <w:t>4</w:t>
-      </w:r>
-      <w:r>
-        <w:t xml:space="preserve"> </w:t>
-      </w:r>
-      <w:r>
-        <w:rPr>
-          <w:highlight w:val="yellow"/>
-        </w:rPr>
-        <w:t>Affiliation to confirm (Field Museum of Natural History, in Condit et al. 2019a)</w:t>
-      </w:r>
-    </w:p>
-    <w:p>
-      <w:pPr>
-        <w:pStyle w:val="BodyText"/>
-      </w:pPr>
-      <w:r>
-        <w:t xml:space="preserve">Corresponding author: </w:t>
-      </w:r>
-      <w:r>
-        <w:rPr>
-          <w:highlight w:val="yellow"/>
-        </w:rPr>
-        <w:t>name, email</w:t>
-      </w:r>
-    </w:p>
-    <w:p>
-      <w:pPr>
-        <w:pStyle w:val="Heading1"/>
-      </w:pPr>
-      <w:bookmarkStart w:id="0" w:name="_keywords"/>
-      <w:r>
-        <w:t>Keywords</w:t>
-      </w:r>
-      <w:bookmarkEnd w:id="0"/>
-    </w:p>
-    <w:p>
-      <w:pPr>
-        <w:pStyle w:val="FirstParagraph"/>
-      </w:pPr>
-      <w:r>
-        <w:t>Barro Colorado Island; demography; forest dynamics plot; ForestGEO; long-term monitoring; Panama; tropical moist forest</w:t>
-      </w:r>
-    </w:p>
-    <w:p>
-      <w:pPr>
-        <w:pStyle w:val="Heading1"/>
-      </w:pPr>
-      <w:bookmarkStart w:id="1" w:name="_acknowledgments"/>
-      <w:r>
-        <w:t>Acknowledgments</w:t>
-      </w:r>
-      <w:bookmarkEnd w:id="1"/>
-    </w:p>
-    <w:p>
-      <w:pPr>
-        <w:pStyle w:val="FirstParagraph"/>
       </w:pPr>
       <w:r>
         <w:rPr>
           <w:b/>
           <w:bCs/>
         </w:rPr>
-        <w:t>Funding.</w:t>
-      </w:r>
-      <w:r>
-        <w:t xml:space="preserve"> The BCI forest dynamics research project was made possible by National Science Foundation grants to Stephen P. Hubbell: DEB-0640386, DEB-0425651, DEB-0346488, DEB-0129874, DEB-00753102, DEB-9909347, DEB-9615226, DEB-9405933, DEB-9221033, DEB-9100058, DEB-8906869, DEB-8605042, DEB-8206992, DEB-7922197, support from the Forest Global Earth Observatory (ForestGEO), the Smithsonian Tropical Research Institute, the John D. and Catherine T. MacArthur Foundation, the Mellon Foundation, the Small World Institute Fund, and numerous private individuals, and through the hard work of over 100 people from </w:t>
-      </w:r>
-      <w:r>
-        <w:t>several</w:t>
-      </w:r>
-      <w:r>
-        <w:t xml:space="preserve"> countries over the past four decades. The plot project is part of ForestGEO, a global network of large-scale demographic tree plots. </w:t>
+        <w:t>ORCID iDs</w:t>
+      </w:r>
+      <w:r>
+        <w:br/>
+      </w:r>
+      <w:r>
+        <w:t xml:space="preserve">David Mitre: https://orcid.org/</w:t>
       </w:r>
       <w:r>
         <w:rPr>
           <w:highlight w:val="yellow"/>
         </w:rPr>
-        <w:t>This is ForestGEO’s required wording, with “three decades” changed to “four”. ForestGEO lists DEB-9615226 twice and writes DEB-00753102, which has one digit too many; confirm the number. Add the support of the 2010, 2015 and 2022–2023 censuses: the Smithsonian Institution (Office of the Under Secretary for Science and Research), ForestGEO and its donors, including the Frank H. Levinson Family Foundation, with grant numbers.</w:t>
+        <w:t xml:space="preserve">                    </w:t>
+      </w:r>
+      <w:r>
+        <w:br/>
+      </w:r>
+      <w:r>
+        <w:t xml:space="preserve">Rolando Pérez: https://orcid.org/</w:t>
+      </w:r>
+      <w:r>
+        <w:rPr>
+          <w:highlight w:val="yellow"/>
+        </w:rPr>
+        <w:t xml:space="preserve">                    </w:t>
+      </w:r>
+      <w:r>
+        <w:br/>
+      </w:r>
+      <w:r>
+        <w:t xml:space="preserve">Salomón Aguilar: https://orcid.org/</w:t>
+      </w:r>
+      <w:r>
+        <w:rPr>
+          <w:highlight w:val="yellow"/>
+        </w:rPr>
+        <w:t xml:space="preserve">                    </w:t>
+      </w:r>
+      <w:r>
+        <w:br/>
+      </w:r>
+      <w:r>
+        <w:t xml:space="preserve">Suzanne Lao: https://orcid.org/</w:t>
+      </w:r>
+      <w:r>
+        <w:rPr>
+          <w:highlight w:val="yellow"/>
+        </w:rPr>
+        <w:t xml:space="preserve">                    </w:t>
+      </w:r>
+      <w:r>
+        <w:br/>
+      </w:r>
+      <w:r>
+        <w:t xml:space="preserve">Stuart J. Davies: https://orcid.org/</w:t>
+      </w:r>
+      <w:r>
+        <w:rPr>
+          <w:highlight w:val="yellow"/>
+        </w:rPr>
+        <w:t xml:space="preserve">                    </w:t>
+      </w:r>
+      <w:r>
+        <w:br/>
+      </w:r>
+      <w:r>
+        <w:t xml:space="preserve">José A. Medina-Vega: https://orcid.org/</w:t>
+      </w:r>
+      <w:r>
+        <w:rPr>
+          <w:highlight w:val="yellow"/>
+        </w:rPr>
+        <w:t xml:space="preserve">                    </w:t>
       </w:r>
     </w:p>
     <w:p>
       <w:pPr>
         <w:pStyle w:val="BodyText"/>
+      </w:pPr>
+      <w:r>
+        <w:t xml:space="preserve">Corresponding author: </w:t>
+      </w:r>
+      <w:r>
+        <w:rPr>
+          <w:highlight w:val="yellow"/>
+        </w:rPr>
+        <w:t>name, email</w:t>
+      </w:r>
+    </w:p>
+    <w:p>
+      <w:pPr>
+        <w:pStyle w:val="Heading1"/>
+      </w:pPr>
+      <w:bookmarkStart w:id="0" w:name="_keywords"/>
+      <w:r>
+        <w:t>Keywords</w:t>
+      </w:r>
+      <w:bookmarkEnd w:id="0"/>
+    </w:p>
+    <w:p>
+      <w:pPr>
+        <w:pStyle w:val="FirstParagraph"/>
+      </w:pPr>
+      <w:r>
+        <w:t>Barro Colorado Island; demography; forest dynamics plot; ForestGEO; long-term monitoring; Panama; tropical moist forest</w:t>
+      </w:r>
+    </w:p>
+    <w:p>
+      <w:pPr>
+        <w:pStyle w:val="Heading1"/>
+      </w:pPr>
+      <w:bookmarkStart w:id="1" w:name="_acknowledgments"/>
+      <w:r>
+        <w:t>Acknowledgments</w:t>
+      </w:r>
+      <w:bookmarkEnd w:id="1"/>
+    </w:p>
+    <w:p>
+      <w:pPr>
+        <w:pStyle w:val="FirstParagraph"/>
       </w:pPr>
       <w:r>
         <w:rPr>
           <w:b/>
           <w:bCs/>
         </w:rPr>
-        <w:t>Field stations, marine laboratories and related research institutions.</w:t>
-      </w:r>
-      <w:r>
-        <w:t xml:space="preserve"> The data were collected in the Barro Colorado Nature Monument, Panama, at the Barro Colorado Island research station of the Smithsonian Tropical Research Institute (9.15° N, 79.85° W). We thank the Smithsonian Tropical Research Institute for logistical support.</w:t>
+        <w:t>Funding.</w:t>
+      </w:r>
+      <w:r>
+        <w:t xml:space="preserve"> The Barro Colorado Island (BCI) forest dynamics research project was made possible by National Science Foundation grants to Stephen P. Hubbell: DEB-0640386, DEB-0425651, DEB-0346488, DEB-0129874, DEB-00753102, DEB-9909347, DEB-9615226, DEB-9405933, DEB-9221033, DEB-9100058, DEB-8906869, DEB-8605042, DEB-8206992 and DEB-7922197, support from the Forest Global Earth Observatory, the Smithsonian Tropical Research Institute, the John D. and Catherine T. MacArthur Foundation, the Mellon Foundation, the Small World Institute Fund and numerous private individuals, and through the hard work of over 100 people from 10 countries over the past four decades. The plot project is part of the Forest Global Earth Observatory (ForestGEO), a global network of large-scale demographic tree plots. Additional support came from the Frank H. Levinson Family Foundation.</w:t>
       </w:r>
     </w:p>
     <w:p>
@@ -257,6 +233,21 @@
           <w:b/>
           <w:bCs/>
         </w:rPr>
+        <w:t>Field stations, marine laboratories and related research institutions.</w:t>
+      </w:r>
+      <w:r>
+        <w:t xml:space="preserve"> The data were collected in the Barro Colorado Nature Monument, Panama, at the Barro Colorado Island research station of the Smithsonian Tropical Research Institute (9.15° N, 79.85° W). We thank the Smithsonian Tropical Research Institute for logistical support.</w:t>
+      </w:r>
+    </w:p>
+    <w:p>
+      <w:pPr>
+        <w:pStyle w:val="BodyText"/>
+      </w:pPr>
+      <w:r>
+        <w:rPr>
+          <w:b/>
+          <w:bCs/>
+        </w:rPr>
         <w:t>Additional acknowledgments.</w:t>
       </w:r>
       <w:r>
@@ -266,7 +257,7 @@
         <w:rPr>
           <w:highlight w:val="yellow"/>
         </w:rPr>
-        <w:t>names, from D. Mitre</w:t>
+        <w:t>Name1, Name2, Name3</w:t>
       </w:r>
       <w:r>
         <w:t>.</w:t>
@@ -293,11 +284,7 @@
         <w:t>Draft; each author to confirm.</w:t>
       </w:r>
       <w:r>
-        <w:t xml:space="preserve"> David Mitre: investigation, data curation. Rolando Pérez and Salomón Aguilar: investigation, data curation (taxonomy). Suzanne Lao: data curation, investigation. Richard Condit: conceptualization, methodology, investigation, data curation, funding acquisition, project administration. Stephen P. Hubbell: conceptualization, methodology, investigation, funding acquisition, </w:t>
-      </w:r>
-      <w:r>
-        <w:lastRenderedPageBreak/>
-        <w:t>project administration. Robin B. Foster: conceptualization, methodology, investigation. Stuart J. Davies: funding acquisition, project administration, resources, supervision. José A. Medina-Vega: methodology (stem reconstruction), software, formal analysis, data curation (R tables), validation, writing – original draft. All authors: writing – review and editing.</w:t>
+        <w:t xml:space="preserve"> David Mitre: investigation, data curation. Rolando Pérez and Salomón Aguilar: investigation, data curation (taxonomy). Suzanne Lao: data curation, investigation. Stuart J. Davies: funding acquisition, project administration, resources, supervision. José A. Medina-Vega: methodology (stem reconstruction), software, formal analysis, data curation (R tables), validation, writing – original draft. All authors: writing – review and editing.</w:t>
       </w:r>
     </w:p>
     <w:p>
@@ -348,7 +335,7 @@
         <w:t>−1</w:t>
       </w:r>
       <w:r>
-        <w:t>; bootstrap 95% interval 4,023–4,114) of 300 species, 179 genera and 59 families, and a basal area of 34.31 m</w:t>
+        <w:t>) of 300 species, 179 genera and 59 families, and a basal area of 31.35 m</w:t>
       </w:r>
       <w:r>
         <w:rPr>
@@ -366,7 +353,7 @@
         <w:t>−1</w:t>
       </w:r>
       <w:r>
-        <w:t xml:space="preserve"> (95% interval 33.00–35.53). Abundance was uneven: 212 species (70.7%) had fewer than 339 individuals (half the mean abundance), 67 had ten or fewer, and 22 were singletons. </w:t>
+        <w:t xml:space="preserve">, from the diameters as recorded. Abundance was uneven: 212 species (70.7%) had fewer than 339 individuals (half the mean abundance), 67 had ten or fewer, and 22 were singletons. </w:t>
       </w:r>
       <w:r>
         <w:rPr>
@@ -413,7 +400,7 @@
           <w:i/>
           <w:iCs/>
         </w:rPr>
-        <w:t>Alseis blackiana</w:t>
+        <w:t>Prioria copaifera</w:t>
       </w:r>
       <w:r>
         <w:t xml:space="preserve"> and </w:t>
@@ -423,7 +410,7 @@
           <w:i/>
           <w:iCs/>
         </w:rPr>
-        <w:t>Prioria copaifera</w:t>
+        <w:t>Alseis blackiana</w:t>
       </w:r>
       <w:r>
         <w:t xml:space="preserve"> had the largest basal areas. Rubiaceae, Violaceae and Fabaceae had the most individuals, and Malvaceae, Fabaceae and Rubiaceae the largest basal areas. Users should note that stem identities before 2010 are reconstructed, not observed; that diameters below 55 mm were recorded in 5-mm classes in 1982 and 1985; that the height of measurement rises over time on buttressed and damaged trunks; and that census 9 was taken 7.5 years after census 8. The data support studies of tree demography and species coexistence, of multi-stemmed and resprouting trees, of biomass and carbon dynamics, and of forest responses to climate. They supersede the 2019 release (Condit et al. 2019a).</w:t>
@@ -456,7 +443,7 @@
         <w:pStyle w:val="BodyText"/>
       </w:pPr>
       <w:r>
-        <w:t>The last public release (Condit et al. 2019a) held eight censuses, 1982–2015, with stems as the database recorded them. This release adds the ninth census, taken in 2022–2023 after the census begun in 2020 was stopped by the COVID-19 pandemic. It updates the species names and documents the names that changed since 2019. And it makes stems comparable across censuses. Before 2010 the database followed trees, not stems: the tree tag was on the main stem, and the other stems of a tree often received a new database identifier at each census, which cut their histories. Since 2010 every stem has carried its own tag. We reconstructed the earlier stem histories under a model of growth, mortality and recruitment, with their uncertainty, so that stem growth, mortality and recruitment can be computed over four decades.</w:t>
+        <w:t>The last public release (Condit et al. 2019a) held eight censuses, 1982–2015, with stems as the database recorded them. This release adds the ninth census, taken in 2022–2023 after the census begun in 2020 was stopped by the COVID-19 pandemic. It updates the species names, documents the names that changed since 2019, and makes stems comparable across censuses. Before 2010 the database followed trees, not stems: the tree tag was on the main stem, and the other stems of a tree often received a new database identifier at each census, which cut their histories. Since 2010 every stem has carried its own tag. We reconstructed the earlier stem histories, with their uncertainty, so that stem growth, mortality and recruitment can be computed over four decades.</w:t>
       </w:r>
     </w:p>
     <w:p>
@@ -509,7 +496,7 @@
         <w:t>license: CC0 1.0 or CC BY 4.0</w:t>
       </w:r>
       <w:r>
-        <w:t xml:space="preserve">. The data are R data files (Table 2): the nine census tables and the species table in the ForestGEO R-table format, and the posterior samples of the stem reconstruction. R is free and open source. The package code loads the files and reproduces every table and number of this paper. The code that builds the tables from the export of the ForestGEO database, including the stem reconstruction, is at </w:t>
+        <w:t xml:space="preserve">. The data are R data files (Table 2). The package code loads the files and reproduces every table and number of this paper. The code that builds the tables from the export of the ForestGEO database, including the stem reconstruction, is at </w:t>
       </w:r>
       <w:hyperlink r:id="rId5">
         <w:r>
@@ -663,7 +650,7 @@
         <w:t>bci.stem9</w:t>
       </w:r>
       <w:r>
-        <w:t xml:space="preserve">) follow the ForestGEO R-table format, one table per census. Each has 646,813 rows and 17 columns (Table 3): one row for every stem ever recorded, in the same order in all tables (by </w:t>
+        <w:t xml:space="preserve">, in the ForestGEO R-table format) each have 646,813 rows and 17 columns (Table 3): one row for every stem ever recorded, in the same order in all tables (by </w:t>
       </w:r>
       <w:r>
         <w:rPr>
@@ -735,131 +722,218 @@
           <w:b/>
           <w:bCs/>
         </w:rPr>
-        <w:t>Records and status.</w:t>
-      </w:r>
-      <w:r>
-        <w:t xml:space="preserve"> Each row keeps the field record unedited: diameter (</w:t>
-      </w:r>
-      <w:r>
-        <w:rPr>
-          <w:rStyle w:val="VerbatimChar"/>
-        </w:rPr>
-        <w:t>dbh</w:t>
-      </w:r>
-      <w:r>
-        <w:t>, mm), height of measurement (</w:t>
-      </w:r>
-      <w:r>
-        <w:rPr>
-          <w:rStyle w:val="VerbatimChar"/>
-        </w:rPr>
-        <w:t>hom</w:t>
-      </w:r>
-      <w:r>
-        <w:t>, m), date (</w:t>
-      </w:r>
-      <w:r>
-        <w:rPr>
-          <w:rStyle w:val="VerbatimChar"/>
-        </w:rPr>
-        <w:t>ExactDate</w:t>
-      </w:r>
-      <w:r>
-        <w:t>), codes and field status (</w:t>
-      </w:r>
-      <w:r>
-        <w:rPr>
-          <w:rStyle w:val="VerbatimChar"/>
-        </w:rPr>
-        <w:t>DFstatus</w:t>
-      </w:r>
-      <w:r>
-        <w:t xml:space="preserve">); these are empty in a census without a record. </w:t>
-      </w:r>
-      <w:r>
-        <w:rPr>
-          <w:rStyle w:val="VerbatimChar"/>
-        </w:rPr>
-        <w:t>Rstatus</w:t>
-      </w:r>
-      <w:r>
-        <w:t xml:space="preserve"> gives every stem a status in every census (Table 4), </w:t>
-      </w:r>
-      <w:r>
-        <w:rPr>
-          <w:rStyle w:val="VerbatimChar"/>
-        </w:rPr>
-        <w:t>date</w:t>
-      </w:r>
-      <w:r>
-        <w:t xml:space="preserve"> gives every row a date, and </w:t>
-      </w:r>
-      <w:r>
-        <w:rPr>
-          <w:rStyle w:val="VerbatimChar"/>
-        </w:rPr>
-        <w:t>gx</w:t>
+        <w:t>Census 9.</w:t>
+      </w:r>
+      <w:r>
+        <w:t xml:space="preserve"> The living trees of 2022–2023 (4,070 ha</w:t>
+      </w:r>
+      <w:r>
+        <w:rPr>
+          <w:vertAlign w:val="superscript"/>
+        </w:rPr>
+        <w:t>−1</w:t>
+      </w:r>
+      <w:r>
+        <w:t xml:space="preserve">) belonged to 300 species, 179 genera and 59 families and had a basal area of 31.35 m</w:t>
+      </w:r>
+      <w:r>
+        <w:rPr>
+          <w:vertAlign w:val="superscript"/>
+        </w:rPr>
+        <w:t>2</w:t>
+      </w:r>
+      <w:r>
+        <w:t xml:space="preserve"> ha</w:t>
+      </w:r>
+      <w:r>
+        <w:rPr>
+          <w:vertAlign w:val="superscript"/>
+        </w:rPr>
+        <w:t>−1</w:t>
+      </w:r>
+      <w:r>
+        <w:t xml:space="preserve">, from the diameters as recorded. Of the species, 212 (70.7%) had fewer than 339 individuals (half the mean abundance), 67 had ten or fewer, and 22 were singletons. </w:t>
+      </w:r>
+      <w:r>
+        <w:rPr>
+          <w:i/>
+          <w:iCs/>
+        </w:rPr>
+        <w:t>Pombalia prunifolia</w:t>
+      </w:r>
+      <w:r>
+        <w:t xml:space="preserve">, </w:t>
+      </w:r>
+      <w:r>
+        <w:rPr>
+          <w:i/>
+          <w:iCs/>
+        </w:rPr>
+        <w:t>Faramea occidentalis</w:t>
       </w:r>
       <w:r>
         <w:t xml:space="preserve"> and </w:t>
       </w:r>
       <w:r>
         <w:rPr>
-          <w:rStyle w:val="VerbatimChar"/>
-        </w:rPr>
-        <w:t>gy</w:t>
-      </w:r>
-      <w:r>
-        <w:t xml:space="preserve"> give one location per tree.</w:t>
-      </w:r>
-    </w:p>
-    <w:p>
-      <w:pPr>
-        <w:pStyle w:val="Heading1"/>
-      </w:pPr>
-      <w:bookmarkStart w:id="8" w:name="_1471c892dc6fdf861f7d8b14b23813665a14d7a"/>
-      <w:r>
-        <w:t>Summary of Methods</w:t>
-      </w:r>
-      <w:bookmarkEnd w:id="8"/>
-    </w:p>
-    <w:p>
-      <w:pPr>
-        <w:pStyle w:val="FirstParagraph"/>
+          <w:i/>
+          <w:iCs/>
+        </w:rPr>
+        <w:t>Trichilia tuberculata</w:t>
+      </w:r>
+      <w:r>
+        <w:t xml:space="preserve"> made up 27.7% of the trees, and </w:t>
+      </w:r>
+      <w:r>
+        <w:rPr>
+          <w:i/>
+          <w:iCs/>
+        </w:rPr>
+        <w:t>Quararibea stenophylla</w:t>
+      </w:r>
+      <w:r>
+        <w:t xml:space="preserve">, </w:t>
+      </w:r>
+      <w:r>
+        <w:rPr>
+          <w:i/>
+          <w:iCs/>
+        </w:rPr>
+        <w:t>Prioria copaifera</w:t>
+      </w:r>
+      <w:r>
+        <w:t xml:space="preserve"> and </w:t>
+      </w:r>
+      <w:r>
+        <w:rPr>
+          <w:i/>
+          <w:iCs/>
+        </w:rPr>
+        <w:t>Alseis blackiana</w:t>
+      </w:r>
+      <w:r>
+        <w:t xml:space="preserve"> had the largest basal areas. Rubiaceae, Violaceae and Fabaceae had the most trees, and Malvaceae, Fabaceae and Rubiaceae the largest basal areas.</w:t>
+      </w:r>
+    </w:p>
+    <w:p>
+      <w:pPr>
+        <w:pStyle w:val="BodyText"/>
       </w:pPr>
       <w:r>
         <w:rPr>
           <w:b/>
           <w:bCs/>
         </w:rPr>
-        <w:t>Site.</w:t>
-      </w:r>
-      <w:r>
-        <w:t xml:space="preserve"> BCI (9.15° N, 79.85° W) is a 15.6-km</w:t>
-      </w:r>
-      <w:r>
-        <w:rPr>
-          <w:vertAlign w:val="superscript"/>
-        </w:rPr>
-        <w:t>2</w:t>
-      </w:r>
-      <w:r>
-        <w:t xml:space="preserve"> island in Gatun Lake, Panama, isolated when the lake was formed during the construction of the Panama Canal (1910–1914) and protected since 1923. It is part of the Barro Colorado Nature Monument, where the Smithsonian Tropical Research Institute runs a field station. The plot lies on the central plateau of the island, at 120–160 m above sea level, in old-growth lowland tropical moist forest that includes a small area of younger forest (Harms et al. 2001). From 1982 to 2023, annual rainfall averaged 2,621 mm (SD 510 mm; range 1,699–4,135 mm), 9% of it in the dry season from January to April (Leigh 1999); the monthly mean air temperature ranged from 25.1 °C in November to 26.8 °C in April, around an annual mean of 25.9 °C (Paton 2026).</w:t>
-      </w:r>
-    </w:p>
-    <w:p>
-      <w:pPr>
-        <w:pStyle w:val="BodyText"/>
+        <w:t>Records and status.</w:t>
+      </w:r>
+      <w:r>
+        <w:t xml:space="preserve"> Each row keeps the field record unedited: diameter (</w:t>
+      </w:r>
+      <w:r>
+        <w:rPr>
+          <w:rStyle w:val="VerbatimChar"/>
+        </w:rPr>
+        <w:t>dbh</w:t>
+      </w:r>
+      <w:r>
+        <w:t>, mm), height of measurement (</w:t>
+      </w:r>
+      <w:r>
+        <w:rPr>
+          <w:rStyle w:val="VerbatimChar"/>
+        </w:rPr>
+        <w:t>hom</w:t>
+      </w:r>
+      <w:r>
+        <w:t>, m), date (</w:t>
+      </w:r>
+      <w:r>
+        <w:rPr>
+          <w:rStyle w:val="VerbatimChar"/>
+        </w:rPr>
+        <w:t>ExactDate</w:t>
+      </w:r>
+      <w:r>
+        <w:t>), codes and field status (</w:t>
+      </w:r>
+      <w:r>
+        <w:rPr>
+          <w:rStyle w:val="VerbatimChar"/>
+        </w:rPr>
+        <w:t>DFstatus</w:t>
+      </w:r>
+      <w:r>
+        <w:t xml:space="preserve">); these are empty in a census without a record. </w:t>
+      </w:r>
+      <w:r>
+        <w:rPr>
+          <w:rStyle w:val="VerbatimChar"/>
+        </w:rPr>
+        <w:t>Rstatus</w:t>
+      </w:r>
+      <w:r>
+        <w:t xml:space="preserve"> gives every stem a status in every census (Table 4), </w:t>
+      </w:r>
+      <w:r>
+        <w:rPr>
+          <w:rStyle w:val="VerbatimChar"/>
+        </w:rPr>
+        <w:t>date</w:t>
+      </w:r>
+      <w:r>
+        <w:t xml:space="preserve"> gives every row a date, and </w:t>
+      </w:r>
+      <w:r>
+        <w:rPr>
+          <w:rStyle w:val="VerbatimChar"/>
+        </w:rPr>
+        <w:t>gx</w:t>
+      </w:r>
+      <w:r>
+        <w:t xml:space="preserve"> and </w:t>
+      </w:r>
+      <w:r>
+        <w:rPr>
+          <w:rStyle w:val="VerbatimChar"/>
+        </w:rPr>
+        <w:t>gy</w:t>
+      </w:r>
+      <w:r>
+        <w:t xml:space="preserve"> give one location per tree.</w:t>
+      </w:r>
+    </w:p>
+    <w:p>
+      <w:pPr>
+        <w:pStyle w:val="Heading1"/>
+      </w:pPr>
+      <w:bookmarkStart w:id="8" w:name="_1471c892dc6fdf861f7d8b14b23813665a14d7a"/>
+      <w:r>
+        <w:t>Summary of Methods</w:t>
+      </w:r>
+      <w:bookmarkEnd w:id="8"/>
+    </w:p>
+    <w:p>
+      <w:pPr>
+        <w:pStyle w:val="FirstParagraph"/>
       </w:pPr>
       <w:r>
         <w:rPr>
           <w:b/>
           <w:bCs/>
         </w:rPr>
-        <w:t>Census protocol.</w:t>
-      </w:r>
-      <w:r>
-        <w:t xml:space="preserve"> The censuses follow Condit (1998) and the ForestGEO standards (Condit et al. 2014). Every free-standing woody stem with a DBH of at least 10 mm is mapped within its 20 × 20 m quadrat, identified and measured at 1.3 m or, where the trunk is buttressed or deformed there, above the irregularity, and the height of measurement is recorded. Each tree carries a numbered tag; since 2010 every stem has also carried its own tag, whereas before 2010 the other stems of a tree were measured untagged. Each census revisits every tree recorded before and adds the stems that have reached 10 mm. In 1982 and 1985 diameters below 55 mm were recorded in 5-mm classes. The plot’s botanists identify the plants in the field.</w:t>
+        <w:t>Site.</w:t>
+      </w:r>
+      <w:r>
+        <w:t xml:space="preserve"> BCI (9.15° N, 79.85° W) is a 15.6-km</w:t>
+      </w:r>
+      <w:r>
+        <w:rPr>
+          <w:vertAlign w:val="superscript"/>
+        </w:rPr>
+        <w:t>2</w:t>
+      </w:r>
+      <w:r>
+        <w:t xml:space="preserve"> island in Gatun Lake, Panama, isolated when the lake was formed during the construction of the Panama Canal (1910–1914) and protected since 1923. It is part of the Barro Colorado Nature Monument, where the Smithsonian Tropical Research Institute runs a field station. The plot lies on the central plateau of the island, at 120–160 m above sea level, in old-growth lowland tropical moist forest that includes a small area of younger forest (Harms et al. 2001). From 1982 to 2023, annual rainfall averaged 2,621 mm (range 1,699–4,135 mm), 9% of it in the dry season from January to April (Leigh 1999), and the mean air temperature was 25.9 °C (Paton 2026).</w:t>
       </w:r>
     </w:p>
     <w:p>
@@ -871,10 +945,10 @@
           <w:b/>
           <w:bCs/>
         </w:rPr>
-        <w:t>From the database to the tables.</w:t>
-      </w:r>
-      <w:r>
-        <w:t xml:space="preserve"> The records were exported from the plot’s ForestGEO database on 13 October 2026, without the partial census of 2020 (135 of 1,250 quadrats). A stem measured at two heights in one census keeps the higher measurement. Species codes come from the database and names from the lists of the plot’s botanists, with the Flora de Panamá list taking priority, checked against World Flora Online (WFO 2026; Kindt 2020).</w:t>
+        <w:t>Census protocol.</w:t>
+      </w:r>
+      <w:r>
+        <w:t xml:space="preserve"> The censuses follow Condit (1998) and the ForestGEO standards (Condit et al. 2014). Every free-standing woody stem with a DBH of at least 10 mm is mapped within its 20 × 20 m quadrat, identified and measured at 1.3 m or, where the trunk is buttressed or deformed there, above the irregularity, and the height of measurement is recorded. Each tree carries a numbered tag; since 2010 every stem has also carried its own tag, whereas before 2010 the other stems of a tree were measured untagged. Each census revisits every tree recorded before and adds the stems that have reached 10 mm. The plot’s botanists identify the plants in the field.</w:t>
       </w:r>
     </w:p>
     <w:p>
@@ -886,6 +960,21 @@
           <w:b/>
           <w:bCs/>
         </w:rPr>
+        <w:t>From the database to the tables.</w:t>
+      </w:r>
+      <w:r>
+        <w:t xml:space="preserve"> The records were exported from the plot’s ForestGEO database on 13 October 2026, without the partial census of 2020 (135 of 1,250 quadrats). A stem measured at two heights in one census keeps the higher measurement. Species codes come from the database and names from the lists of the plot’s botanists, with the Flora de Panamá list taking priority, checked against World Flora Online (WFO 2026; Kindt 2020).</w:t>
+      </w:r>
+    </w:p>
+    <w:p>
+      <w:pPr>
+        <w:pStyle w:val="BodyText"/>
+      </w:pPr>
+      <w:r>
+        <w:rPr>
+          <w:b/>
+          <w:bCs/>
+        </w:rPr>
         <w:t>Stem reconstruction.</w:t>
       </w:r>
       <w:r>
@@ -1029,7 +1118,7 @@
         <w:t>Census timing.</w:t>
       </w:r>
       <w:r>
-        <w:t xml:space="preserve"> Censuses took up to 19 months (95% of the records; Table 1), intervals differ among quadrats, census 9 came 7.5 years after census 8, and the interrupted census of 2020 is not included. Intervals should be computed from </w:t>
+        <w:t xml:space="preserve"> Censuses took up to 19 months, intervals differ among quadrats, and the interrupted census of 2020 is not included. Intervals should be computed from </w:t>
       </w:r>
       <w:r>
         <w:rPr>
@@ -1116,11 +1205,11 @@
         <w:pStyle w:val="FirstParagraph"/>
       </w:pPr>
       <w:r>
-        <w:t xml:space="preserve">Nine censuses over four decades, with stems that can be followed throughout, make stem-level questions open that earlier releases could not address. Multiple stems and resprouting are common in tropical trees but rarely followed over time: the tables allow rates of stem ingrowth, stem death and </w:t>
+        <w:t xml:space="preserve">Stems that can be followed through nine censuses over four decades open questions that earlier releases could not address. Multiple stems and resprouting are common in tropical trees but rarely followed over time: the tables allow rates of stem ingrowth, stem death and </w:t>
       </w:r>
       <w:r>
         <w:lastRenderedPageBreak/>
-        <w:t>resprouting after damage to be estimated for some 300 species and compared with tree-level recruitment and mortality. The ninth census, after an interval that spans the 2015–2016 El Niño drought, extends tests of directional change in composition, growth and mortality (Feeley et al. 2011; Condit et al. 2017) and of the stability of biomass (Rutishauser et al. 2020; Piponiot et al. 2024). The species table, with growth forms and documented name changes, supports trait-based and phylogenetic analyses of demographic trade-offs (Rüger et al. 2018, 2020) and coexistence (Hubbell et al. 1999; Comita et al. 2010). The posterior samples let the uncertainty of stem identity be carried into estimates of stocks and fluxes, a source of error rarely quantified in plot data. The tables can also calibrate remote sensing of canopy change and test individual-based and demographic vegetation models. Finally, the reconstruction method applies to other ForestGEO plots whose early censuses did not tag every stem.</w:t>
+        <w:t>resprouting after damage to be estimated for some 300 species and compared with tree-level recruitment and mortality. The ninth census, after an interval that spans the 2015–2016 El Niño drought, extends tests of directional change in composition, growth and mortality (Feeley et al. 2011; Condit et al. 2017) and of the stability of biomass (Rutishauser et al. 2020; Piponiot et al. 2024). The species table, with growth forms and documented name changes, supports trait-based and phylogenetic analyses of demographic trade-offs (Rüger et al. 2018, 2020) and coexistence (Hubbell et al. 1999; Comita et al. 2010). The posterior samples let the uncertainty of stem identity be carried into estimates of stocks and fluxes, a source of error rarely quantified in plot data. The tables can also calibrate remote sensing of canopy change and test vegetation models. Finally, the reconstruction method applies to other ForestGEO plots whose early censuses did not tag every stem.</w:t>
       </w:r>
     </w:p>
     <w:p>

</xml_diff>